<commit_message>
comparing methodological approahces for aligning benefit data temporally
</commit_message>
<xml_diff>
--- a/output_figs/table_gap_vs_rolling.docx
+++ b/output_figs/table_gap_vs_rolling.docx
@@ -37,7 +37,7 @@
       <w:tblGrid>
         <w:gridCol w:w="1670"/>
         <w:gridCol w:w="1157"/>
-        <w:gridCol w:w="1206"/>
+        <w:gridCol w:w="1095"/>
         <w:gridCol w:w="1157"/>
         <w:gridCol w:w="1095"/>
       </w:tblGrid>
@@ -594,7 +594,7 @@
                 <w:szCs w:val="22"/>
                 <w:color w:val="B0413E"/>
               </w:rPr>
-              <w:t xml:space="preserve">45.07%</w:t>
+              <w:t xml:space="preserve">44.07%</w:t>
             </w:r>
           </w:p>
         </w:tc>
@@ -649,7 +649,7 @@
                 <w:szCs w:val="22"/>
                 <w:color w:val="B0413E"/>
               </w:rPr>
-              <w:t xml:space="preserve">94,752</w:t>
+              <w:t xml:space="preserve">93,038</w:t>
             </w:r>
           </w:p>
         </w:tc>
@@ -704,7 +704,7 @@
                 <w:szCs w:val="22"/>
                 <w:color w:val="B8801E"/>
               </w:rPr>
-              <w:t xml:space="preserve">13.77%</w:t>
+              <w:t xml:space="preserve">13.99%</w:t>
             </w:r>
           </w:p>
         </w:tc>
@@ -759,7 +759,7 @@
                 <w:szCs w:val="22"/>
                 <w:color w:val="B8801E"/>
               </w:rPr>
-              <w:t xml:space="preserve">28,950</w:t>
+              <w:t xml:space="preserve">29,531</w:t>
             </w:r>
           </w:p>
         </w:tc>
@@ -874,7 +874,7 @@
                 <w:szCs w:val="22"/>
                 <w:color w:val="B0413E"/>
               </w:rPr>
-              <w:t xml:space="preserve">45.08%</w:t>
+              <w:t xml:space="preserve">44.46%</w:t>
             </w:r>
           </w:p>
         </w:tc>
@@ -929,7 +929,7 @@
                 <w:szCs w:val="22"/>
                 <w:color w:val="B0413E"/>
               </w:rPr>
-              <w:t xml:space="preserve">69,094</w:t>
+              <w:t xml:space="preserve">64,363</w:t>
             </w:r>
           </w:p>
         </w:tc>
@@ -984,7 +984,7 @@
                 <w:szCs w:val="22"/>
                 <w:color w:val="B8801E"/>
               </w:rPr>
-              <w:t xml:space="preserve">13.35%</w:t>
+              <w:t xml:space="preserve">11.97%</w:t>
             </w:r>
           </w:p>
         </w:tc>
@@ -1039,7 +1039,7 @@
                 <w:szCs w:val="22"/>
                 <w:color w:val="B8801E"/>
               </w:rPr>
-              <w:t xml:space="preserve">20,462</w:t>
+              <w:t xml:space="preserve">17,326</w:t>
             </w:r>
           </w:p>
         </w:tc>
@@ -1154,7 +1154,7 @@
                 <w:szCs w:val="22"/>
                 <w:color w:val="B0413E"/>
               </w:rPr>
-              <w:t xml:space="preserve">45.54%</w:t>
+              <w:t xml:space="preserve">45.67%</w:t>
             </w:r>
           </w:p>
         </w:tc>
@@ -1209,7 +1209,7 @@
                 <w:szCs w:val="22"/>
                 <w:color w:val="B0413E"/>
               </w:rPr>
-              <w:t xml:space="preserve">104,915</w:t>
+              <w:t xml:space="preserve">99,900</w:t>
             </w:r>
           </w:p>
         </w:tc>
@@ -1264,7 +1264,7 @@
                 <w:szCs w:val="22"/>
                 <w:color w:val="B8801E"/>
               </w:rPr>
-              <w:t xml:space="preserve">14.92%</w:t>
+              <w:t xml:space="preserve">14.18%</w:t>
             </w:r>
           </w:p>
         </w:tc>
@@ -1319,7 +1319,7 @@
                 <w:szCs w:val="22"/>
                 <w:color w:val="B8801E"/>
               </w:rPr>
-              <w:t xml:space="preserve">34,371</w:t>
+              <w:t xml:space="preserve">31,030</w:t>
             </w:r>
           </w:p>
         </w:tc>
@@ -1434,7 +1434,7 @@
                 <w:szCs w:val="22"/>
                 <w:color w:val="B0413E"/>
               </w:rPr>
-              <w:t xml:space="preserve">43.35%</w:t>
+              <w:t xml:space="preserve">42.91%</w:t>
             </w:r>
           </w:p>
         </w:tc>
@@ -1489,7 +1489,7 @@
                 <w:szCs w:val="22"/>
                 <w:color w:val="B0413E"/>
               </w:rPr>
-              <w:t xml:space="preserve">54,229</w:t>
+              <w:t xml:space="preserve">52,400</w:t>
             </w:r>
           </w:p>
         </w:tc>
@@ -1544,7 +1544,7 @@
                 <w:szCs w:val="22"/>
                 <w:color w:val="B8801E"/>
               </w:rPr>
-              <w:t xml:space="preserve">15.28%</w:t>
+              <w:t xml:space="preserve">14.94%</w:t>
             </w:r>
           </w:p>
         </w:tc>
@@ -1599,7 +1599,7 @@
                 <w:szCs w:val="22"/>
                 <w:color w:val="B8801E"/>
               </w:rPr>
-              <w:t xml:space="preserve">19,109</w:t>
+              <w:t xml:space="preserve">18,248</w:t>
             </w:r>
           </w:p>
         </w:tc>
@@ -1714,7 +1714,7 @@
                 <w:szCs w:val="22"/>
                 <w:color w:val="B0413E"/>
               </w:rPr>
-              <w:t xml:space="preserve">1.75%</w:t>
+              <w:t xml:space="preserve">1.19%</w:t>
             </w:r>
           </w:p>
         </w:tc>
@@ -1824,7 +1824,7 @@
                 <w:szCs w:val="22"/>
                 <w:color w:val="B8801E"/>
               </w:rPr>
-              <w:t xml:space="preserve">1.28%</w:t>
+              <w:t xml:space="preserve">1.49%</w:t>
             </w:r>
           </w:p>
         </w:tc>

</xml_diff>